<commit_message>
Added Macro 1 for PowerToys Command Palette
</commit_message>
<xml_diff>
--- a/silakka54_layout_visual.docx
+++ b/silakka54_layout_visual.docx
@@ -1202,7 +1202,11 @@
           </mc:Choice>
           <mc:Fallback>
             <w:pict>
-              <v:shape w14:anchorId="4CE4CA93" id="_x0000_s1033" type="#_x0000_t202" style="position:absolute;margin-left:280.65pt;margin-top:93.15pt;width:26.95pt;height:19.85pt;z-index:251742208;visibility:visible;mso-wrap-style:square;mso-width-percent:0;mso-height-percent:0;mso-wrap-distance-left:9pt;mso-wrap-distance-top:0;mso-wrap-distance-right:9pt;mso-wrap-distance-bottom:0;mso-position-horizontal:absolute;mso-position-horizontal-relative:text;mso-position-vertical:absolute;mso-position-vertical-relative:text;mso-width-percent:0;mso-height-percent:0;mso-width-relative:margin;mso-height-relative:margin;v-text-anchor:top" o:gfxdata="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" filled="f" stroked="f" strokeweight=".5pt">
+              <v:shapetype w14:anchorId="4CE4CA93" id="_x0000_t202" coordsize="21600,21600" o:spt="202" path="m,l,21600r21600,l21600,xe">
+                <v:stroke joinstyle="miter"/>
+                <v:path gradientshapeok="t" o:connecttype="rect"/>
+              </v:shapetype>
+              <v:shape id="_x0000_s1033" type="#_x0000_t202" style="position:absolute;margin-left:280.65pt;margin-top:93.15pt;width:26.95pt;height:19.85pt;z-index:251742208;visibility:visible;mso-wrap-style:square;mso-width-percent:0;mso-height-percent:0;mso-wrap-distance-left:9pt;mso-wrap-distance-top:0;mso-wrap-distance-right:9pt;mso-wrap-distance-bottom:0;mso-position-horizontal:absolute;mso-position-horizontal-relative:text;mso-position-vertical:absolute;mso-position-vertical-relative:text;mso-width-percent:0;mso-height-percent:0;mso-width-relative:margin;mso-height-relative:margin;v-text-anchor:top" o:gfxdata="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" filled="f" stroked="f" strokeweight=".5pt">
                 <v:textbox>
                   <w:txbxContent>
                     <w:p>
@@ -10933,6 +10937,111 @@
         <mc:AlternateContent>
           <mc:Choice Requires="wps">
             <w:drawing>
+              <wp:anchor distT="0" distB="0" distL="114300" distR="114300" simplePos="0" relativeHeight="251852800" behindDoc="0" locked="0" layoutInCell="1" allowOverlap="1" wp14:anchorId="2176E94A" wp14:editId="1F7D6553">
+                <wp:simplePos x="0" y="0"/>
+                <wp:positionH relativeFrom="column">
+                  <wp:posOffset>2184177</wp:posOffset>
+                </wp:positionH>
+                <wp:positionV relativeFrom="paragraph">
+                  <wp:posOffset>2157730</wp:posOffset>
+                </wp:positionV>
+                <wp:extent cx="552202" cy="364490"/>
+                <wp:effectExtent l="0" t="0" r="0" b="0"/>
+                <wp:wrapNone/>
+                <wp:docPr id="1154241826" name="Text Box 1"/>
+                <wp:cNvGraphicFramePr/>
+                <a:graphic xmlns:a="http://schemas.openxmlformats.org/drawingml/2006/main">
+                  <a:graphicData uri="http://schemas.microsoft.com/office/word/2010/wordprocessingShape">
+                    <wps:wsp>
+                      <wps:cNvSpPr txBox="1"/>
+                      <wps:spPr>
+                        <a:xfrm>
+                          <a:off x="0" y="0"/>
+                          <a:ext cx="552202" cy="364490"/>
+                        </a:xfrm>
+                        <a:prstGeom prst="rect">
+                          <a:avLst/>
+                        </a:prstGeom>
+                        <a:noFill/>
+                        <a:ln w="6350">
+                          <a:noFill/>
+                        </a:ln>
+                      </wps:spPr>
+                      <wps:txbx>
+                        <w:txbxContent>
+                          <w:p>
+                            <w:pPr>
+                              <w:spacing w:after="0"/>
+                              <w:jc w:val="center"/>
+                              <w:rPr>
+                                <w:sz w:val="12"/>
+                                <w:szCs w:val="12"/>
+                              </w:rPr>
+                            </w:pPr>
+                            <w:r>
+                              <w:rPr>
+                                <w:sz w:val="12"/>
+                                <w:szCs w:val="12"/>
+                              </w:rPr>
+                              <w:t>Command Palette</w:t>
+                            </w:r>
+                          </w:p>
+                        </w:txbxContent>
+                      </wps:txbx>
+                      <wps:bodyPr rot="0" spcFirstLastPara="0" vertOverflow="overflow" horzOverflow="overflow" vert="horz" wrap="square" lIns="91440" tIns="45720" rIns="91440" bIns="45720" numCol="1" spcCol="0" rtlCol="0" fromWordArt="0" anchor="t" anchorCtr="0" forceAA="0" compatLnSpc="1">
+                        <a:prstTxWarp prst="textNoShape">
+                          <a:avLst/>
+                        </a:prstTxWarp>
+                        <a:noAutofit/>
+                      </wps:bodyPr>
+                    </wps:wsp>
+                  </a:graphicData>
+                </a:graphic>
+                <wp14:sizeRelH relativeFrom="margin">
+                  <wp14:pctWidth>0</wp14:pctWidth>
+                </wp14:sizeRelH>
+                <wp14:sizeRelV relativeFrom="margin">
+                  <wp14:pctHeight>0</wp14:pctHeight>
+                </wp14:sizeRelV>
+              </wp:anchor>
+            </w:drawing>
+          </mc:Choice>
+          <mc:Fallback>
+            <w:pict>
+              <v:shape w14:anchorId="2176E94A" id="_x0000_s1082" type="#_x0000_t202" style="position:absolute;margin-left:172pt;margin-top:169.9pt;width:43.5pt;height:28.7pt;z-index:251852800;visibility:visible;mso-wrap-style:square;mso-width-percent:0;mso-height-percent:0;mso-wrap-distance-left:9pt;mso-wrap-distance-top:0;mso-wrap-distance-right:9pt;mso-wrap-distance-bottom:0;mso-position-horizontal:absolute;mso-position-horizontal-relative:text;mso-position-vertical:absolute;mso-position-vertical-relative:text;mso-width-percent:0;mso-height-percent:0;mso-width-relative:margin;mso-height-relative:margin;v-text-anchor:top" o:gfxdata="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" filled="f" stroked="f" strokeweight=".5pt">
+                <v:textbox>
+                  <w:txbxContent>
+                    <w:p>
+                      <w:pPr>
+                        <w:spacing w:after="0"/>
+                        <w:jc w:val="center"/>
+                        <w:rPr>
+                          <w:sz w:val="12"/>
+                          <w:szCs w:val="12"/>
+                        </w:rPr>
+                      </w:pPr>
+                      <w:r>
+                        <w:rPr>
+                          <w:sz w:val="12"/>
+                          <w:szCs w:val="12"/>
+                        </w:rPr>
+                        <w:t>Command Palette</w:t>
+                      </w:r>
+                    </w:p>
+                  </w:txbxContent>
+                </v:textbox>
+              </v:shape>
+            </w:pict>
+          </mc:Fallback>
+        </mc:AlternateContent>
+      </w:r>
+      <w:r>
+        <w:rPr>
+          <w:noProof/>
+        </w:rPr>
+        <mc:AlternateContent>
+          <mc:Choice Requires="wps">
+            <w:drawing>
               <wp:anchor distT="0" distB="0" distL="114300" distR="114300" simplePos="0" relativeHeight="251846656" behindDoc="0" locked="0" layoutInCell="1" allowOverlap="1" wp14:anchorId="0F449DB2" wp14:editId="7DA2CD24">
                 <wp:simplePos x="0" y="0"/>
                 <wp:positionH relativeFrom="column">
@@ -11753,7 +11862,7 @@
           </mc:Choice>
           <mc:Fallback>
             <w:pict>
-              <v:shape w14:anchorId="3D942462" id="_x0000_s1089" type="#_x0000_t202" style="position:absolute;margin-left:244.65pt;margin-top:70.75pt;width:36.65pt;height:17.7pt;z-index:251799552;visibility:visible;mso-wrap-style:square;mso-width-percent:0;mso-height-percent:0;mso-wrap-distance-left:9pt;mso-wrap-distance-top:0;mso-wrap-distance-right:9pt;mso-wrap-distance-bottom:0;mso-position-horizontal:absolute;mso-position-horizontal-relative:text;mso-position-vertical:absolute;mso-position-vertical-relative:text;mso-width-percent:0;mso-height-percent:0;mso-width-relative:margin;mso-height-relative:margin;v-text-anchor:top" o:gfxdata="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" filled="f" stroked="f" strokeweight=".5pt">
+              <v:shape w14:anchorId="3D942462" id="_x0000_s1090" type="#_x0000_t202" style="position:absolute;margin-left:244.65pt;margin-top:70.75pt;width:36.65pt;height:17.7pt;z-index:251799552;visibility:visible;mso-wrap-style:square;mso-width-percent:0;mso-height-percent:0;mso-wrap-distance-left:9pt;mso-wrap-distance-top:0;mso-wrap-distance-right:9pt;mso-wrap-distance-bottom:0;mso-position-horizontal:absolute;mso-position-horizontal-relative:text;mso-position-vertical:absolute;mso-position-vertical-relative:text;mso-width-percent:0;mso-height-percent:0;mso-width-relative:margin;mso-height-relative:margin;v-text-anchor:top" o:gfxdata="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" filled="f" stroked="f" strokeweight=".5pt">
                 <v:textbox>
                   <w:txbxContent>
                     <w:p>
@@ -12509,7 +12618,7 @@
           </mc:Choice>
           <mc:Fallback>
             <w:pict>
-              <v:shape w14:anchorId="6995557B" id="_x0000_s1096" type="#_x0000_t202" style="position:absolute;margin-left:244.45pt;margin-top:166.2pt;width:36.2pt;height:28.7pt;z-index:251838464;visibility:visible;mso-wrap-style:square;mso-width-percent:0;mso-height-percent:0;mso-wrap-distance-left:9pt;mso-wrap-distance-top:0;mso-wrap-distance-right:9pt;mso-wrap-distance-bottom:0;mso-position-horizontal:absolute;mso-position-horizontal-relative:text;mso-position-vertical:absolute;mso-position-vertical-relative:text;mso-width-percent:0;mso-height-percent:0;mso-width-relative:margin;mso-height-relative:margin;v-text-anchor:top" o:gfxdata="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" filled="f" stroked="f" strokeweight=".5pt">
+              <v:shape w14:anchorId="6995557B" id="_x0000_s1097" type="#_x0000_t202" style="position:absolute;margin-left:244.45pt;margin-top:166.2pt;width:36.2pt;height:28.7pt;z-index:251838464;visibility:visible;mso-wrap-style:square;mso-width-percent:0;mso-height-percent:0;mso-wrap-distance-left:9pt;mso-wrap-distance-top:0;mso-wrap-distance-right:9pt;mso-wrap-distance-bottom:0;mso-position-horizontal:absolute;mso-position-horizontal-relative:text;mso-position-vertical:absolute;mso-position-vertical-relative:text;mso-width-percent:0;mso-height-percent:0;mso-width-relative:margin;mso-height-relative:margin;v-text-anchor:top" o:gfxdata="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" filled="f" stroked="f" strokeweight=".5pt">
                 <v:textbox>
                   <w:txbxContent>
                     <w:p>
@@ -14557,10 +14666,10 @@
       <w:r>
         <w:lastRenderedPageBreak/>
         <w:drawing>
-          <wp:inline distT="0" distB="0" distL="0" distR="0" wp14:anchorId="197DD001" wp14:editId="35FA3976">
-            <wp:extent cx="5943600" cy="5763260"/>
-            <wp:effectExtent l="0" t="0" r="0" b="8890"/>
-            <wp:docPr id="937163906" name="Picture 1" descr="A screenshot of a computer keyboard&#10;&#10;AI-generated content may be incorrect."/>
+          <wp:inline distT="0" distB="0" distL="0" distR="0" wp14:anchorId="0EAF1260" wp14:editId="206FB6F8">
+            <wp:extent cx="5943600" cy="5488940"/>
+            <wp:effectExtent l="0" t="0" r="0" b="0"/>
+            <wp:docPr id="259273663" name="Picture 1" descr="A screenshot of a computer keyboard&#10;&#10;AI-generated content may be incorrect."/>
             <wp:cNvGraphicFramePr>
               <a:graphicFrameLocks xmlns:a="http://schemas.openxmlformats.org/drawingml/2006/main" noChangeAspect="1"/>
             </wp:cNvGraphicFramePr>
@@ -14568,7 +14677,7 @@
               <a:graphicData uri="http://schemas.openxmlformats.org/drawingml/2006/picture">
                 <pic:pic xmlns:pic="http://schemas.openxmlformats.org/drawingml/2006/picture">
                   <pic:nvPicPr>
-                    <pic:cNvPr id="937163906" name="Picture 1" descr="A screenshot of a computer keyboard&#10;&#10;AI-generated content may be incorrect."/>
+                    <pic:cNvPr id="259273663" name="Picture 1" descr="A screenshot of a computer keyboard&#10;&#10;AI-generated content may be incorrect."/>
                     <pic:cNvPicPr/>
                   </pic:nvPicPr>
                   <pic:blipFill>
@@ -14580,7 +14689,7 @@
                   <pic:spPr>
                     <a:xfrm>
                       <a:off x="0" y="0"/>
-                      <a:ext cx="5943600" cy="5763260"/>
+                      <a:ext cx="5943600" cy="5488940"/>
                     </a:xfrm>
                     <a:prstGeom prst="rect">
                       <a:avLst/>

</xml_diff>